<commit_message>
Feat: create basic for project coffe shop network
</commit_message>
<xml_diff>
--- a/001 - estudo pessoal/013 - Simular servidor HTTP/Manual Passo a Passo servidor HTTP.docx
+++ b/001 - estudo pessoal/013 - Simular servidor HTTP/Manual Passo a Passo servidor HTTP.docx
@@ -1090,6 +1090,1097 @@
                     <a:xfrm>
                       <a:off x="0" y="0"/>
                       <a:ext cx="5400040" cy="1590675"/>
+                    </a:xfrm>
+                    <a:prstGeom prst="rect">
+                      <a:avLst/>
+                    </a:prstGeom>
+                  </pic:spPr>
+                </pic:pic>
+              </a:graphicData>
+            </a:graphic>
+          </wp:inline>
+        </w:drawing>
+      </w:r>
+    </w:p>
+    <w:p/>
+    <w:p>
+      <w:r>
+        <w:t xml:space="preserve">6 – Depois disso sera necessario definir os Ips utilizados para os servidores, iremos definir de forma estatica. </w:t>
+      </w:r>
+    </w:p>
+    <w:p>
+      <w:r>
+        <w:t>Para definir os Ips sera necessario entrar no menu servidor -&gt; DESKTOP -&gt; Ip configuration.</w:t>
+      </w:r>
+    </w:p>
+    <w:p>
+      <w:r>
+        <w:t>Para o servidor do google sera definido o IP 192.168.1.1</w:t>
+      </w:r>
+    </w:p>
+    <w:p>
+      <w:r>
+        <w:t xml:space="preserve">Para o servidor do </w:t>
+      </w:r>
+      <w:r>
+        <w:t xml:space="preserve">Yahoo </w:t>
+      </w:r>
+      <w:r>
+        <w:t xml:space="preserve"> sera definido o IP 192.168.1.</w:t>
+      </w:r>
+      <w:r>
+        <w:t>2</w:t>
+      </w:r>
+    </w:p>
+    <w:p>
+      <w:r>
+        <w:t xml:space="preserve">Para o servidor do </w:t>
+      </w:r>
+      <w:r>
+        <w:t>D</w:t>
+      </w:r>
+      <w:r>
+        <w:t>HCP</w:t>
+      </w:r>
+      <w:r>
+        <w:t xml:space="preserve"> sera definido o IP 192.168.1.</w:t>
+      </w:r>
+      <w:r>
+        <w:t>3</w:t>
+      </w:r>
+    </w:p>
+    <w:p>
+      <w:r>
+        <w:t xml:space="preserve">Para o servidor do </w:t>
+      </w:r>
+      <w:r>
+        <w:t>DNS</w:t>
+      </w:r>
+      <w:r>
+        <w:t xml:space="preserve"> sera definido o IP 192.168.1.</w:t>
+      </w:r>
+      <w:r>
+        <w:t>4</w:t>
+      </w:r>
+    </w:p>
+    <w:p>
+      <w:r>
+        <w:drawing>
+          <wp:inline distT="0" distB="0" distL="0" distR="0" wp14:anchorId="5945F151" wp14:editId="29199C93">
+            <wp:extent cx="5400040" cy="1761490"/>
+            <wp:effectExtent l="0" t="0" r="0" b="0"/>
+            <wp:docPr id="30909417" name="Picture 1"/>
+            <wp:cNvGraphicFramePr>
+              <a:graphicFrameLocks xmlns:a="http://schemas.openxmlformats.org/drawingml/2006/main" noChangeAspect="1"/>
+            </wp:cNvGraphicFramePr>
+            <a:graphic xmlns:a="http://schemas.openxmlformats.org/drawingml/2006/main">
+              <a:graphicData uri="http://schemas.openxmlformats.org/drawingml/2006/picture">
+                <pic:pic xmlns:pic="http://schemas.openxmlformats.org/drawingml/2006/picture">
+                  <pic:nvPicPr>
+                    <pic:cNvPr id="30909417" name=""/>
+                    <pic:cNvPicPr/>
+                  </pic:nvPicPr>
+                  <pic:blipFill>
+                    <a:blip r:embed="rId14"/>
+                    <a:stretch>
+                      <a:fillRect/>
+                    </a:stretch>
+                  </pic:blipFill>
+                  <pic:spPr>
+                    <a:xfrm>
+                      <a:off x="0" y="0"/>
+                      <a:ext cx="5400040" cy="1761490"/>
+                    </a:xfrm>
+                    <a:prstGeom prst="rect">
+                      <a:avLst/>
+                    </a:prstGeom>
+                  </pic:spPr>
+                </pic:pic>
+              </a:graphicData>
+            </a:graphic>
+          </wp:inline>
+        </w:drawing>
+      </w:r>
+    </w:p>
+    <w:p/>
+    <w:p>
+      <w:r>
+        <w:drawing>
+          <wp:inline distT="0" distB="0" distL="0" distR="0" wp14:anchorId="47FC93FF" wp14:editId="21EEAED0">
+            <wp:extent cx="5400040" cy="1462405"/>
+            <wp:effectExtent l="0" t="0" r="0" b="4445"/>
+            <wp:docPr id="1316314514" name="Picture 1"/>
+            <wp:cNvGraphicFramePr>
+              <a:graphicFrameLocks xmlns:a="http://schemas.openxmlformats.org/drawingml/2006/main" noChangeAspect="1"/>
+            </wp:cNvGraphicFramePr>
+            <a:graphic xmlns:a="http://schemas.openxmlformats.org/drawingml/2006/main">
+              <a:graphicData uri="http://schemas.openxmlformats.org/drawingml/2006/picture">
+                <pic:pic xmlns:pic="http://schemas.openxmlformats.org/drawingml/2006/picture">
+                  <pic:nvPicPr>
+                    <pic:cNvPr id="1316314514" name=""/>
+                    <pic:cNvPicPr/>
+                  </pic:nvPicPr>
+                  <pic:blipFill>
+                    <a:blip r:embed="rId15"/>
+                    <a:stretch>
+                      <a:fillRect/>
+                    </a:stretch>
+                  </pic:blipFill>
+                  <pic:spPr>
+                    <a:xfrm>
+                      <a:off x="0" y="0"/>
+                      <a:ext cx="5400040" cy="1462405"/>
+                    </a:xfrm>
+                    <a:prstGeom prst="rect">
+                      <a:avLst/>
+                    </a:prstGeom>
+                  </pic:spPr>
+                </pic:pic>
+              </a:graphicData>
+            </a:graphic>
+          </wp:inline>
+        </w:drawing>
+      </w:r>
+    </w:p>
+    <w:p/>
+    <w:p>
+      <w:r>
+        <w:lastRenderedPageBreak/>
+        <w:drawing>
+          <wp:inline distT="0" distB="0" distL="0" distR="0" wp14:anchorId="7BC4B66F" wp14:editId="70A387CE">
+            <wp:extent cx="5400040" cy="1381125"/>
+            <wp:effectExtent l="0" t="0" r="0" b="9525"/>
+            <wp:docPr id="453149655" name="Picture 1"/>
+            <wp:cNvGraphicFramePr>
+              <a:graphicFrameLocks xmlns:a="http://schemas.openxmlformats.org/drawingml/2006/main" noChangeAspect="1"/>
+            </wp:cNvGraphicFramePr>
+            <a:graphic xmlns:a="http://schemas.openxmlformats.org/drawingml/2006/main">
+              <a:graphicData uri="http://schemas.openxmlformats.org/drawingml/2006/picture">
+                <pic:pic xmlns:pic="http://schemas.openxmlformats.org/drawingml/2006/picture">
+                  <pic:nvPicPr>
+                    <pic:cNvPr id="453149655" name=""/>
+                    <pic:cNvPicPr/>
+                  </pic:nvPicPr>
+                  <pic:blipFill>
+                    <a:blip r:embed="rId16"/>
+                    <a:stretch>
+                      <a:fillRect/>
+                    </a:stretch>
+                  </pic:blipFill>
+                  <pic:spPr>
+                    <a:xfrm>
+                      <a:off x="0" y="0"/>
+                      <a:ext cx="5400040" cy="1381125"/>
+                    </a:xfrm>
+                    <a:prstGeom prst="rect">
+                      <a:avLst/>
+                    </a:prstGeom>
+                  </pic:spPr>
+                </pic:pic>
+              </a:graphicData>
+            </a:graphic>
+          </wp:inline>
+        </w:drawing>
+      </w:r>
+    </w:p>
+    <w:p/>
+    <w:p>
+      <w:r>
+        <w:drawing>
+          <wp:inline distT="0" distB="0" distL="0" distR="0" wp14:anchorId="27D7D833" wp14:editId="6B33D04A">
+            <wp:extent cx="5400040" cy="1556385"/>
+            <wp:effectExtent l="0" t="0" r="0" b="5715"/>
+            <wp:docPr id="2051044744" name="Picture 1"/>
+            <wp:cNvGraphicFramePr>
+              <a:graphicFrameLocks xmlns:a="http://schemas.openxmlformats.org/drawingml/2006/main" noChangeAspect="1"/>
+            </wp:cNvGraphicFramePr>
+            <a:graphic xmlns:a="http://schemas.openxmlformats.org/drawingml/2006/main">
+              <a:graphicData uri="http://schemas.openxmlformats.org/drawingml/2006/picture">
+                <pic:pic xmlns:pic="http://schemas.openxmlformats.org/drawingml/2006/picture">
+                  <pic:nvPicPr>
+                    <pic:cNvPr id="2051044744" name=""/>
+                    <pic:cNvPicPr/>
+                  </pic:nvPicPr>
+                  <pic:blipFill>
+                    <a:blip r:embed="rId17"/>
+                    <a:stretch>
+                      <a:fillRect/>
+                    </a:stretch>
+                  </pic:blipFill>
+                  <pic:spPr>
+                    <a:xfrm>
+                      <a:off x="0" y="0"/>
+                      <a:ext cx="5400040" cy="1556385"/>
+                    </a:xfrm>
+                    <a:prstGeom prst="rect">
+                      <a:avLst/>
+                    </a:prstGeom>
+                  </pic:spPr>
+                </pic:pic>
+              </a:graphicData>
+            </a:graphic>
+          </wp:inline>
+        </w:drawing>
+      </w:r>
+    </w:p>
+    <w:p/>
+    <w:p>
+      <w:r>
+        <w:t>7 – Antes de configurar o servidor DHCP sera necessario desligar todas as funcionalidades que nao sejam referentes a do DHCP para que funcione precisamente</w:t>
+      </w:r>
+      <w:r>
+        <w:t>. Para acessar necessario abrir o menu do servidor 0 DHCP -&gt; Services e acessar o menu laterial e desligar as funcionalidades que nao sao DHCP.</w:t>
+      </w:r>
+    </w:p>
+    <w:p>
+      <w:r>
+        <w:drawing>
+          <wp:inline distT="0" distB="0" distL="0" distR="0" wp14:anchorId="66BAE6CA" wp14:editId="3D5E106A">
+            <wp:extent cx="5400040" cy="3491865"/>
+            <wp:effectExtent l="0" t="0" r="0" b="0"/>
+            <wp:docPr id="2016737185" name="Picture 1"/>
+            <wp:cNvGraphicFramePr>
+              <a:graphicFrameLocks xmlns:a="http://schemas.openxmlformats.org/drawingml/2006/main" noChangeAspect="1"/>
+            </wp:cNvGraphicFramePr>
+            <a:graphic xmlns:a="http://schemas.openxmlformats.org/drawingml/2006/main">
+              <a:graphicData uri="http://schemas.openxmlformats.org/drawingml/2006/picture">
+                <pic:pic xmlns:pic="http://schemas.openxmlformats.org/drawingml/2006/picture">
+                  <pic:nvPicPr>
+                    <pic:cNvPr id="2016737185" name=""/>
+                    <pic:cNvPicPr/>
+                  </pic:nvPicPr>
+                  <pic:blipFill>
+                    <a:blip r:embed="rId18"/>
+                    <a:stretch>
+                      <a:fillRect/>
+                    </a:stretch>
+                  </pic:blipFill>
+                  <pic:spPr>
+                    <a:xfrm>
+                      <a:off x="0" y="0"/>
+                      <a:ext cx="5400040" cy="3491865"/>
+                    </a:xfrm>
+                    <a:prstGeom prst="rect">
+                      <a:avLst/>
+                    </a:prstGeom>
+                  </pic:spPr>
+                </pic:pic>
+              </a:graphicData>
+            </a:graphic>
+          </wp:inline>
+        </w:drawing>
+      </w:r>
+    </w:p>
+    <w:p/>
+    <w:p>
+      <w:r>
+        <w:lastRenderedPageBreak/>
+        <w:drawing>
+          <wp:inline distT="0" distB="0" distL="0" distR="0" wp14:anchorId="242648F5" wp14:editId="1CC336FB">
+            <wp:extent cx="5400040" cy="2439670"/>
+            <wp:effectExtent l="0" t="0" r="0" b="0"/>
+            <wp:docPr id="1322716743" name="Picture 1"/>
+            <wp:cNvGraphicFramePr>
+              <a:graphicFrameLocks xmlns:a="http://schemas.openxmlformats.org/drawingml/2006/main" noChangeAspect="1"/>
+            </wp:cNvGraphicFramePr>
+            <a:graphic xmlns:a="http://schemas.openxmlformats.org/drawingml/2006/main">
+              <a:graphicData uri="http://schemas.openxmlformats.org/drawingml/2006/picture">
+                <pic:pic xmlns:pic="http://schemas.openxmlformats.org/drawingml/2006/picture">
+                  <pic:nvPicPr>
+                    <pic:cNvPr id="1322716743" name=""/>
+                    <pic:cNvPicPr/>
+                  </pic:nvPicPr>
+                  <pic:blipFill>
+                    <a:blip r:embed="rId19"/>
+                    <a:stretch>
+                      <a:fillRect/>
+                    </a:stretch>
+                  </pic:blipFill>
+                  <pic:spPr>
+                    <a:xfrm>
+                      <a:off x="0" y="0"/>
+                      <a:ext cx="5400040" cy="2439670"/>
+                    </a:xfrm>
+                    <a:prstGeom prst="rect">
+                      <a:avLst/>
+                    </a:prstGeom>
+                  </pic:spPr>
+                </pic:pic>
+              </a:graphicData>
+            </a:graphic>
+          </wp:inline>
+        </w:drawing>
+      </w:r>
+    </w:p>
+    <w:p/>
+    <w:p>
+      <w:r>
+        <w:drawing>
+          <wp:inline distT="0" distB="0" distL="0" distR="0" wp14:anchorId="543D3E00" wp14:editId="09D9A887">
+            <wp:extent cx="5400040" cy="4121150"/>
+            <wp:effectExtent l="0" t="0" r="0" b="0"/>
+            <wp:docPr id="1376764925" name="Picture 1"/>
+            <wp:cNvGraphicFramePr>
+              <a:graphicFrameLocks xmlns:a="http://schemas.openxmlformats.org/drawingml/2006/main" noChangeAspect="1"/>
+            </wp:cNvGraphicFramePr>
+            <a:graphic xmlns:a="http://schemas.openxmlformats.org/drawingml/2006/main">
+              <a:graphicData uri="http://schemas.openxmlformats.org/drawingml/2006/picture">
+                <pic:pic xmlns:pic="http://schemas.openxmlformats.org/drawingml/2006/picture">
+                  <pic:nvPicPr>
+                    <pic:cNvPr id="1376764925" name=""/>
+                    <pic:cNvPicPr/>
+                  </pic:nvPicPr>
+                  <pic:blipFill>
+                    <a:blip r:embed="rId20"/>
+                    <a:stretch>
+                      <a:fillRect/>
+                    </a:stretch>
+                  </pic:blipFill>
+                  <pic:spPr>
+                    <a:xfrm>
+                      <a:off x="0" y="0"/>
+                      <a:ext cx="5400040" cy="4121150"/>
+                    </a:xfrm>
+                    <a:prstGeom prst="rect">
+                      <a:avLst/>
+                    </a:prstGeom>
+                  </pic:spPr>
+                </pic:pic>
+              </a:graphicData>
+            </a:graphic>
+          </wp:inline>
+        </w:drawing>
+      </w:r>
+    </w:p>
+    <w:p/>
+    <w:p>
+      <w:r>
+        <w:lastRenderedPageBreak/>
+        <w:drawing>
+          <wp:inline distT="0" distB="0" distL="0" distR="0" wp14:anchorId="6C2F34A0" wp14:editId="45E86990">
+            <wp:extent cx="5400040" cy="3020695"/>
+            <wp:effectExtent l="0" t="0" r="0" b="8255"/>
+            <wp:docPr id="838198854" name="Picture 1"/>
+            <wp:cNvGraphicFramePr>
+              <a:graphicFrameLocks xmlns:a="http://schemas.openxmlformats.org/drawingml/2006/main" noChangeAspect="1"/>
+            </wp:cNvGraphicFramePr>
+            <a:graphic xmlns:a="http://schemas.openxmlformats.org/drawingml/2006/main">
+              <a:graphicData uri="http://schemas.openxmlformats.org/drawingml/2006/picture">
+                <pic:pic xmlns:pic="http://schemas.openxmlformats.org/drawingml/2006/picture">
+                  <pic:nvPicPr>
+                    <pic:cNvPr id="838198854" name=""/>
+                    <pic:cNvPicPr/>
+                  </pic:nvPicPr>
+                  <pic:blipFill>
+                    <a:blip r:embed="rId21"/>
+                    <a:stretch>
+                      <a:fillRect/>
+                    </a:stretch>
+                  </pic:blipFill>
+                  <pic:spPr>
+                    <a:xfrm>
+                      <a:off x="0" y="0"/>
+                      <a:ext cx="5400040" cy="3020695"/>
+                    </a:xfrm>
+                    <a:prstGeom prst="rect">
+                      <a:avLst/>
+                    </a:prstGeom>
+                  </pic:spPr>
+                </pic:pic>
+              </a:graphicData>
+            </a:graphic>
+          </wp:inline>
+        </w:drawing>
+      </w:r>
+    </w:p>
+    <w:p/>
+    <w:p>
+      <w:r>
+        <w:drawing>
+          <wp:inline distT="0" distB="0" distL="0" distR="0" wp14:anchorId="40FEC1CE" wp14:editId="6D1383A7">
+            <wp:extent cx="5400040" cy="2161540"/>
+            <wp:effectExtent l="0" t="0" r="0" b="0"/>
+            <wp:docPr id="96508195" name="Picture 1"/>
+            <wp:cNvGraphicFramePr>
+              <a:graphicFrameLocks xmlns:a="http://schemas.openxmlformats.org/drawingml/2006/main" noChangeAspect="1"/>
+            </wp:cNvGraphicFramePr>
+            <a:graphic xmlns:a="http://schemas.openxmlformats.org/drawingml/2006/main">
+              <a:graphicData uri="http://schemas.openxmlformats.org/drawingml/2006/picture">
+                <pic:pic xmlns:pic="http://schemas.openxmlformats.org/drawingml/2006/picture">
+                  <pic:nvPicPr>
+                    <pic:cNvPr id="96508195" name=""/>
+                    <pic:cNvPicPr/>
+                  </pic:nvPicPr>
+                  <pic:blipFill>
+                    <a:blip r:embed="rId22"/>
+                    <a:stretch>
+                      <a:fillRect/>
+                    </a:stretch>
+                  </pic:blipFill>
+                  <pic:spPr>
+                    <a:xfrm>
+                      <a:off x="0" y="0"/>
+                      <a:ext cx="5400040" cy="2161540"/>
+                    </a:xfrm>
+                    <a:prstGeom prst="rect">
+                      <a:avLst/>
+                    </a:prstGeom>
+                  </pic:spPr>
+                </pic:pic>
+              </a:graphicData>
+            </a:graphic>
+          </wp:inline>
+        </w:drawing>
+      </w:r>
+    </w:p>
+    <w:p/>
+    <w:p>
+      <w:r>
+        <w:lastRenderedPageBreak/>
+        <w:drawing>
+          <wp:inline distT="0" distB="0" distL="0" distR="0" wp14:anchorId="20598357" wp14:editId="691D5550">
+            <wp:extent cx="5400040" cy="3202940"/>
+            <wp:effectExtent l="0" t="0" r="0" b="0"/>
+            <wp:docPr id="2116850595" name="Picture 1"/>
+            <wp:cNvGraphicFramePr>
+              <a:graphicFrameLocks xmlns:a="http://schemas.openxmlformats.org/drawingml/2006/main" noChangeAspect="1"/>
+            </wp:cNvGraphicFramePr>
+            <a:graphic xmlns:a="http://schemas.openxmlformats.org/drawingml/2006/main">
+              <a:graphicData uri="http://schemas.openxmlformats.org/drawingml/2006/picture">
+                <pic:pic xmlns:pic="http://schemas.openxmlformats.org/drawingml/2006/picture">
+                  <pic:nvPicPr>
+                    <pic:cNvPr id="2116850595" name=""/>
+                    <pic:cNvPicPr/>
+                  </pic:nvPicPr>
+                  <pic:blipFill>
+                    <a:blip r:embed="rId23"/>
+                    <a:stretch>
+                      <a:fillRect/>
+                    </a:stretch>
+                  </pic:blipFill>
+                  <pic:spPr>
+                    <a:xfrm>
+                      <a:off x="0" y="0"/>
+                      <a:ext cx="5400040" cy="3202940"/>
+                    </a:xfrm>
+                    <a:prstGeom prst="rect">
+                      <a:avLst/>
+                    </a:prstGeom>
+                  </pic:spPr>
+                </pic:pic>
+              </a:graphicData>
+            </a:graphic>
+          </wp:inline>
+        </w:drawing>
+      </w:r>
+    </w:p>
+    <w:p/>
+    <w:p>
+      <w:r>
+        <w:drawing>
+          <wp:inline distT="0" distB="0" distL="0" distR="0" wp14:anchorId="3A9406D6" wp14:editId="0BC00DBE">
+            <wp:extent cx="5400040" cy="2612390"/>
+            <wp:effectExtent l="0" t="0" r="0" b="0"/>
+            <wp:docPr id="744721335" name="Picture 1"/>
+            <wp:cNvGraphicFramePr>
+              <a:graphicFrameLocks xmlns:a="http://schemas.openxmlformats.org/drawingml/2006/main" noChangeAspect="1"/>
+            </wp:cNvGraphicFramePr>
+            <a:graphic xmlns:a="http://schemas.openxmlformats.org/drawingml/2006/main">
+              <a:graphicData uri="http://schemas.openxmlformats.org/drawingml/2006/picture">
+                <pic:pic xmlns:pic="http://schemas.openxmlformats.org/drawingml/2006/picture">
+                  <pic:nvPicPr>
+                    <pic:cNvPr id="744721335" name=""/>
+                    <pic:cNvPicPr/>
+                  </pic:nvPicPr>
+                  <pic:blipFill>
+                    <a:blip r:embed="rId24"/>
+                    <a:stretch>
+                      <a:fillRect/>
+                    </a:stretch>
+                  </pic:blipFill>
+                  <pic:spPr>
+                    <a:xfrm>
+                      <a:off x="0" y="0"/>
+                      <a:ext cx="5400040" cy="2612390"/>
+                    </a:xfrm>
+                    <a:prstGeom prst="rect">
+                      <a:avLst/>
+                    </a:prstGeom>
+                  </pic:spPr>
+                </pic:pic>
+              </a:graphicData>
+            </a:graphic>
+          </wp:inline>
+        </w:drawing>
+      </w:r>
+    </w:p>
+    <w:p/>
+    <w:p/>
+    <w:p/>
+    <w:p/>
+    <w:p/>
+    <w:p/>
+    <w:p/>
+    <w:p/>
+    <w:p/>
+    <w:p>
+      <w:r>
+        <w:lastRenderedPageBreak/>
+        <w:t xml:space="preserve">8 – </w:t>
+      </w:r>
+      <w:r>
+        <w:t>Apos desligar os outros servicos irei definir servidor DNS, e onde deve comecar os enderecos IP para os computadores. Em seguida devesse salvar</w:t>
+      </w:r>
+      <w:r>
+        <w:t>. Apos isso os Ips do servidor DHCP ja irao gerar de forma dinamicas Ips para os computadores conectados</w:t>
+      </w:r>
+    </w:p>
+    <w:p>
+      <w:r>
+        <w:drawing>
+          <wp:inline distT="0" distB="0" distL="0" distR="0" wp14:anchorId="654FBFB2" wp14:editId="21E7BD54">
+            <wp:extent cx="5400040" cy="3213735"/>
+            <wp:effectExtent l="0" t="0" r="0" b="5715"/>
+            <wp:docPr id="1898783565" name="Picture 1"/>
+            <wp:cNvGraphicFramePr>
+              <a:graphicFrameLocks xmlns:a="http://schemas.openxmlformats.org/drawingml/2006/main" noChangeAspect="1"/>
+            </wp:cNvGraphicFramePr>
+            <a:graphic xmlns:a="http://schemas.openxmlformats.org/drawingml/2006/main">
+              <a:graphicData uri="http://schemas.openxmlformats.org/drawingml/2006/picture">
+                <pic:pic xmlns:pic="http://schemas.openxmlformats.org/drawingml/2006/picture">
+                  <pic:nvPicPr>
+                    <pic:cNvPr id="1898783565" name=""/>
+                    <pic:cNvPicPr/>
+                  </pic:nvPicPr>
+                  <pic:blipFill>
+                    <a:blip r:embed="rId25"/>
+                    <a:stretch>
+                      <a:fillRect/>
+                    </a:stretch>
+                  </pic:blipFill>
+                  <pic:spPr>
+                    <a:xfrm>
+                      <a:off x="0" y="0"/>
+                      <a:ext cx="5400040" cy="3213735"/>
+                    </a:xfrm>
+                    <a:prstGeom prst="rect">
+                      <a:avLst/>
+                    </a:prstGeom>
+                  </pic:spPr>
+                </pic:pic>
+              </a:graphicData>
+            </a:graphic>
+          </wp:inline>
+        </w:drawing>
+      </w:r>
+    </w:p>
+    <w:p/>
+    <w:p>
+      <w:r>
+        <w:t>9 – Depois disso entrar em um computador e definir o IP de forma dinamica para testar o funcionamento. Ir no menu do computador -&gt; desktop -&gt; IP configuration. Colocar a opcao de DHCP</w:t>
+      </w:r>
+    </w:p>
+    <w:p>
+      <w:r>
+        <w:drawing>
+          <wp:inline distT="0" distB="0" distL="0" distR="0" wp14:anchorId="7B609109" wp14:editId="49DBD90A">
+            <wp:extent cx="5400040" cy="3317875"/>
+            <wp:effectExtent l="0" t="0" r="0" b="0"/>
+            <wp:docPr id="989873881" name="Picture 1"/>
+            <wp:cNvGraphicFramePr>
+              <a:graphicFrameLocks xmlns:a="http://schemas.openxmlformats.org/drawingml/2006/main" noChangeAspect="1"/>
+            </wp:cNvGraphicFramePr>
+            <a:graphic xmlns:a="http://schemas.openxmlformats.org/drawingml/2006/main">
+              <a:graphicData uri="http://schemas.openxmlformats.org/drawingml/2006/picture">
+                <pic:pic xmlns:pic="http://schemas.openxmlformats.org/drawingml/2006/picture">
+                  <pic:nvPicPr>
+                    <pic:cNvPr id="989873881" name=""/>
+                    <pic:cNvPicPr/>
+                  </pic:nvPicPr>
+                  <pic:blipFill>
+                    <a:blip r:embed="rId26"/>
+                    <a:stretch>
+                      <a:fillRect/>
+                    </a:stretch>
+                  </pic:blipFill>
+                  <pic:spPr>
+                    <a:xfrm>
+                      <a:off x="0" y="0"/>
+                      <a:ext cx="5400040" cy="3317875"/>
+                    </a:xfrm>
+                    <a:prstGeom prst="rect">
+                      <a:avLst/>
+                    </a:prstGeom>
+                  </pic:spPr>
+                </pic:pic>
+              </a:graphicData>
+            </a:graphic>
+          </wp:inline>
+        </w:drawing>
+      </w:r>
+    </w:p>
+    <w:p/>
+    <w:p>
+      <w:r>
+        <w:lastRenderedPageBreak/>
+        <w:drawing>
+          <wp:inline distT="0" distB="0" distL="0" distR="0" wp14:anchorId="3A66D3B7" wp14:editId="76BE9A4F">
+            <wp:extent cx="5400040" cy="3634105"/>
+            <wp:effectExtent l="0" t="0" r="0" b="4445"/>
+            <wp:docPr id="1566422601" name="Picture 1"/>
+            <wp:cNvGraphicFramePr>
+              <a:graphicFrameLocks xmlns:a="http://schemas.openxmlformats.org/drawingml/2006/main" noChangeAspect="1"/>
+            </wp:cNvGraphicFramePr>
+            <a:graphic xmlns:a="http://schemas.openxmlformats.org/drawingml/2006/main">
+              <a:graphicData uri="http://schemas.openxmlformats.org/drawingml/2006/picture">
+                <pic:pic xmlns:pic="http://schemas.openxmlformats.org/drawingml/2006/picture">
+                  <pic:nvPicPr>
+                    <pic:cNvPr id="1566422601" name=""/>
+                    <pic:cNvPicPr/>
+                  </pic:nvPicPr>
+                  <pic:blipFill>
+                    <a:blip r:embed="rId27"/>
+                    <a:stretch>
+                      <a:fillRect/>
+                    </a:stretch>
+                  </pic:blipFill>
+                  <pic:spPr>
+                    <a:xfrm>
+                      <a:off x="0" y="0"/>
+                      <a:ext cx="5400040" cy="3634105"/>
+                    </a:xfrm>
+                    <a:prstGeom prst="rect">
+                      <a:avLst/>
+                    </a:prstGeom>
+                  </pic:spPr>
+                </pic:pic>
+              </a:graphicData>
+            </a:graphic>
+          </wp:inline>
+        </w:drawing>
+      </w:r>
+    </w:p>
+    <w:p/>
+    <w:p>
+      <w:r>
+        <w:t>10</w:t>
+      </w:r>
+      <w:r>
+        <w:t xml:space="preserve"> – apos configurar o servidor DHCP iremos configurar o servidor DNS. O protocolo DNS sera o nosso dicionario de acesso de sites, logo irei definir os ips de acesso quando digitar qualquer nome para ser acessado</w:t>
+      </w:r>
+      <w:r>
+        <w:t>. Necessario desligar tudo que nao seja DNS no servidor DNS</w:t>
+      </w:r>
+    </w:p>
+    <w:p>
+      <w:r>
+        <w:drawing>
+          <wp:inline distT="0" distB="0" distL="0" distR="0" wp14:anchorId="39EFCD37" wp14:editId="3C4A03E8">
+            <wp:extent cx="5400040" cy="2574925"/>
+            <wp:effectExtent l="0" t="0" r="0" b="0"/>
+            <wp:docPr id="501760915" name="Picture 1"/>
+            <wp:cNvGraphicFramePr>
+              <a:graphicFrameLocks xmlns:a="http://schemas.openxmlformats.org/drawingml/2006/main" noChangeAspect="1"/>
+            </wp:cNvGraphicFramePr>
+            <a:graphic xmlns:a="http://schemas.openxmlformats.org/drawingml/2006/main">
+              <a:graphicData uri="http://schemas.openxmlformats.org/drawingml/2006/picture">
+                <pic:pic xmlns:pic="http://schemas.openxmlformats.org/drawingml/2006/picture">
+                  <pic:nvPicPr>
+                    <pic:cNvPr id="501760915" name=""/>
+                    <pic:cNvPicPr/>
+                  </pic:nvPicPr>
+                  <pic:blipFill>
+                    <a:blip r:embed="rId28"/>
+                    <a:stretch>
+                      <a:fillRect/>
+                    </a:stretch>
+                  </pic:blipFill>
+                  <pic:spPr>
+                    <a:xfrm>
+                      <a:off x="0" y="0"/>
+                      <a:ext cx="5400040" cy="2574925"/>
+                    </a:xfrm>
+                    <a:prstGeom prst="rect">
+                      <a:avLst/>
+                    </a:prstGeom>
+                  </pic:spPr>
+                </pic:pic>
+              </a:graphicData>
+            </a:graphic>
+          </wp:inline>
+        </w:drawing>
+      </w:r>
+    </w:p>
+    <w:p/>
+    <w:p/>
+    <w:p/>
+    <w:p/>
+    <w:p>
+      <w:r>
+        <w:lastRenderedPageBreak/>
+        <w:t>11 – Apos desligar as outras operacoes sera necessario registrar os sites para acesso na opcao DNS. Depois disso sera necessario apenas apertar o botao de Add</w:t>
+      </w:r>
+    </w:p>
+    <w:p>
+      <w:r>
+        <w:drawing>
+          <wp:inline distT="0" distB="0" distL="0" distR="0" wp14:anchorId="0EBD9255" wp14:editId="6C49257C">
+            <wp:extent cx="5400040" cy="2831465"/>
+            <wp:effectExtent l="0" t="0" r="0" b="6985"/>
+            <wp:docPr id="1482714137" name="Picture 1"/>
+            <wp:cNvGraphicFramePr>
+              <a:graphicFrameLocks xmlns:a="http://schemas.openxmlformats.org/drawingml/2006/main" noChangeAspect="1"/>
+            </wp:cNvGraphicFramePr>
+            <a:graphic xmlns:a="http://schemas.openxmlformats.org/drawingml/2006/main">
+              <a:graphicData uri="http://schemas.openxmlformats.org/drawingml/2006/picture">
+                <pic:pic xmlns:pic="http://schemas.openxmlformats.org/drawingml/2006/picture">
+                  <pic:nvPicPr>
+                    <pic:cNvPr id="1482714137" name=""/>
+                    <pic:cNvPicPr/>
+                  </pic:nvPicPr>
+                  <pic:blipFill>
+                    <a:blip r:embed="rId29"/>
+                    <a:stretch>
+                      <a:fillRect/>
+                    </a:stretch>
+                  </pic:blipFill>
+                  <pic:spPr>
+                    <a:xfrm>
+                      <a:off x="0" y="0"/>
+                      <a:ext cx="5400040" cy="2831465"/>
+                    </a:xfrm>
+                    <a:prstGeom prst="rect">
+                      <a:avLst/>
+                    </a:prstGeom>
+                  </pic:spPr>
+                </pic:pic>
+              </a:graphicData>
+            </a:graphic>
+          </wp:inline>
+        </w:drawing>
+      </w:r>
+    </w:p>
+    <w:p/>
+    <w:p>
+      <w:r>
+        <w:drawing>
+          <wp:inline distT="0" distB="0" distL="0" distR="0" wp14:anchorId="3BEC0DF8" wp14:editId="5FB23936">
+            <wp:extent cx="5400040" cy="2639060"/>
+            <wp:effectExtent l="0" t="0" r="0" b="8890"/>
+            <wp:docPr id="1302208996" name="Picture 1"/>
+            <wp:cNvGraphicFramePr>
+              <a:graphicFrameLocks xmlns:a="http://schemas.openxmlformats.org/drawingml/2006/main" noChangeAspect="1"/>
+            </wp:cNvGraphicFramePr>
+            <a:graphic xmlns:a="http://schemas.openxmlformats.org/drawingml/2006/main">
+              <a:graphicData uri="http://schemas.openxmlformats.org/drawingml/2006/picture">
+                <pic:pic xmlns:pic="http://schemas.openxmlformats.org/drawingml/2006/picture">
+                  <pic:nvPicPr>
+                    <pic:cNvPr id="1302208996" name=""/>
+                    <pic:cNvPicPr/>
+                  </pic:nvPicPr>
+                  <pic:blipFill>
+                    <a:blip r:embed="rId30"/>
+                    <a:stretch>
+                      <a:fillRect/>
+                    </a:stretch>
+                  </pic:blipFill>
+                  <pic:spPr>
+                    <a:xfrm>
+                      <a:off x="0" y="0"/>
+                      <a:ext cx="5400040" cy="2639060"/>
+                    </a:xfrm>
+                    <a:prstGeom prst="rect">
+                      <a:avLst/>
+                    </a:prstGeom>
+                  </pic:spPr>
+                </pic:pic>
+              </a:graphicData>
+            </a:graphic>
+          </wp:inline>
+        </w:drawing>
+      </w:r>
+    </w:p>
+    <w:p/>
+    <w:p/>
+    <w:p/>
+    <w:p/>
+    <w:p/>
+    <w:p/>
+    <w:p/>
+    <w:p/>
+    <w:p>
+      <w:r>
+        <w:lastRenderedPageBreak/>
+        <w:t>13 – Apos isso sera necessario ir nos servidores respectivos de cada site e configurar o Acesso a eles no protocolo HTTP</w:t>
+      </w:r>
+      <w:r>
+        <w:t>. Ir no menu do servidor 2 Google -&gt; services -&gt; HTTP. Na ba acessar o arquivo Index.html e alterar ele</w:t>
+      </w:r>
+    </w:p>
+    <w:p>
+      <w:r>
+        <w:drawing>
+          <wp:inline distT="0" distB="0" distL="0" distR="0" wp14:anchorId="72D2D2C0" wp14:editId="0EB3FDBA">
+            <wp:extent cx="5400040" cy="2891155"/>
+            <wp:effectExtent l="0" t="0" r="0" b="4445"/>
+            <wp:docPr id="1047339663" name="Picture 1"/>
+            <wp:cNvGraphicFramePr>
+              <a:graphicFrameLocks xmlns:a="http://schemas.openxmlformats.org/drawingml/2006/main" noChangeAspect="1"/>
+            </wp:cNvGraphicFramePr>
+            <a:graphic xmlns:a="http://schemas.openxmlformats.org/drawingml/2006/main">
+              <a:graphicData uri="http://schemas.openxmlformats.org/drawingml/2006/picture">
+                <pic:pic xmlns:pic="http://schemas.openxmlformats.org/drawingml/2006/picture">
+                  <pic:nvPicPr>
+                    <pic:cNvPr id="1047339663" name=""/>
+                    <pic:cNvPicPr/>
+                  </pic:nvPicPr>
+                  <pic:blipFill>
+                    <a:blip r:embed="rId31"/>
+                    <a:stretch>
+                      <a:fillRect/>
+                    </a:stretch>
+                  </pic:blipFill>
+                  <pic:spPr>
+                    <a:xfrm>
+                      <a:off x="0" y="0"/>
+                      <a:ext cx="5400040" cy="2891155"/>
+                    </a:xfrm>
+                    <a:prstGeom prst="rect">
+                      <a:avLst/>
+                    </a:prstGeom>
+                  </pic:spPr>
+                </pic:pic>
+              </a:graphicData>
+            </a:graphic>
+          </wp:inline>
+        </w:drawing>
+      </w:r>
+    </w:p>
+    <w:p/>
+    <w:p>
+      <w:r>
+        <w:drawing>
+          <wp:inline distT="0" distB="0" distL="0" distR="0" wp14:anchorId="3330B7B6" wp14:editId="6A6F5BBD">
+            <wp:extent cx="5400040" cy="2903855"/>
+            <wp:effectExtent l="0" t="0" r="0" b="0"/>
+            <wp:docPr id="1820093558" name="Picture 1"/>
+            <wp:cNvGraphicFramePr>
+              <a:graphicFrameLocks xmlns:a="http://schemas.openxmlformats.org/drawingml/2006/main" noChangeAspect="1"/>
+            </wp:cNvGraphicFramePr>
+            <a:graphic xmlns:a="http://schemas.openxmlformats.org/drawingml/2006/main">
+              <a:graphicData uri="http://schemas.openxmlformats.org/drawingml/2006/picture">
+                <pic:pic xmlns:pic="http://schemas.openxmlformats.org/drawingml/2006/picture">
+                  <pic:nvPicPr>
+                    <pic:cNvPr id="1820093558" name=""/>
+                    <pic:cNvPicPr/>
+                  </pic:nvPicPr>
+                  <pic:blipFill>
+                    <a:blip r:embed="rId32"/>
+                    <a:stretch>
+                      <a:fillRect/>
+                    </a:stretch>
+                  </pic:blipFill>
+                  <pic:spPr>
+                    <a:xfrm>
+                      <a:off x="0" y="0"/>
+                      <a:ext cx="5400040" cy="2903855"/>
+                    </a:xfrm>
+                    <a:prstGeom prst="rect">
+                      <a:avLst/>
+                    </a:prstGeom>
+                  </pic:spPr>
+                </pic:pic>
+              </a:graphicData>
+            </a:graphic>
+          </wp:inline>
+        </w:drawing>
+      </w:r>
+    </w:p>
+    <w:p/>
+    <w:p/>
+    <w:p/>
+    <w:p/>
+    <w:p/>
+    <w:p/>
+    <w:p>
+      <w:r>
+        <w:lastRenderedPageBreak/>
+        <w:t>14 – Depois fazer a mesma coisa para o servidor do Yahoo</w:t>
+      </w:r>
+    </w:p>
+    <w:p>
+      <w:r>
+        <w:drawing>
+          <wp:inline distT="0" distB="0" distL="0" distR="0" wp14:anchorId="6FAAA77A" wp14:editId="6B4DDFF8">
+            <wp:extent cx="5400040" cy="3395345"/>
+            <wp:effectExtent l="0" t="0" r="0" b="0"/>
+            <wp:docPr id="1184968607" name="Picture 1"/>
+            <wp:cNvGraphicFramePr>
+              <a:graphicFrameLocks xmlns:a="http://schemas.openxmlformats.org/drawingml/2006/main" noChangeAspect="1"/>
+            </wp:cNvGraphicFramePr>
+            <a:graphic xmlns:a="http://schemas.openxmlformats.org/drawingml/2006/main">
+              <a:graphicData uri="http://schemas.openxmlformats.org/drawingml/2006/picture">
+                <pic:pic xmlns:pic="http://schemas.openxmlformats.org/drawingml/2006/picture">
+                  <pic:nvPicPr>
+                    <pic:cNvPr id="1184968607" name=""/>
+                    <pic:cNvPicPr/>
+                  </pic:nvPicPr>
+                  <pic:blipFill>
+                    <a:blip r:embed="rId33"/>
+                    <a:stretch>
+                      <a:fillRect/>
+                    </a:stretch>
+                  </pic:blipFill>
+                  <pic:spPr>
+                    <a:xfrm>
+                      <a:off x="0" y="0"/>
+                      <a:ext cx="5400040" cy="3395345"/>
+                    </a:xfrm>
+                    <a:prstGeom prst="rect">
+                      <a:avLst/>
+                    </a:prstGeom>
+                  </pic:spPr>
+                </pic:pic>
+              </a:graphicData>
+            </a:graphic>
+          </wp:inline>
+        </w:drawing>
+      </w:r>
+    </w:p>
+    <w:p/>
+    <w:p/>
+    <w:p/>
+    <w:p/>
+    <w:p/>
+    <w:p/>
+    <w:p/>
+    <w:p/>
+    <w:p/>
+    <w:p/>
+    <w:p/>
+    <w:p/>
+    <w:p/>
+    <w:p/>
+    <w:p/>
+    <w:p/>
+    <w:p/>
+    <w:p>
+      <w:r>
+        <w:lastRenderedPageBreak/>
+        <w:t xml:space="preserve">15 – Agora acessar o site de uma maquina qualquer com IP configurado. Ir no menu computador </w:t>
+      </w:r>
+      <w:r>
+        <w:t>-&gt; Desktop -&gt; webBroser e digitar para acessar</w:t>
+      </w:r>
+    </w:p>
+    <w:p>
+      <w:r>
+        <w:drawing>
+          <wp:inline distT="0" distB="0" distL="0" distR="0" wp14:anchorId="166350E3" wp14:editId="5BEBEEE4">
+            <wp:extent cx="5400040" cy="3978275"/>
+            <wp:effectExtent l="0" t="0" r="0" b="3175"/>
+            <wp:docPr id="603735122" name="Picture 1"/>
+            <wp:cNvGraphicFramePr>
+              <a:graphicFrameLocks xmlns:a="http://schemas.openxmlformats.org/drawingml/2006/main" noChangeAspect="1"/>
+            </wp:cNvGraphicFramePr>
+            <a:graphic xmlns:a="http://schemas.openxmlformats.org/drawingml/2006/main">
+              <a:graphicData uri="http://schemas.openxmlformats.org/drawingml/2006/picture">
+                <pic:pic xmlns:pic="http://schemas.openxmlformats.org/drawingml/2006/picture">
+                  <pic:nvPicPr>
+                    <pic:cNvPr id="603735122" name=""/>
+                    <pic:cNvPicPr/>
+                  </pic:nvPicPr>
+                  <pic:blipFill>
+                    <a:blip r:embed="rId34"/>
+                    <a:stretch>
+                      <a:fillRect/>
+                    </a:stretch>
+                  </pic:blipFill>
+                  <pic:spPr>
+                    <a:xfrm>
+                      <a:off x="0" y="0"/>
+                      <a:ext cx="5400040" cy="3978275"/>
+                    </a:xfrm>
+                    <a:prstGeom prst="rect">
+                      <a:avLst/>
+                    </a:prstGeom>
+                  </pic:spPr>
+                </pic:pic>
+              </a:graphicData>
+            </a:graphic>
+          </wp:inline>
+        </w:drawing>
+      </w:r>
+    </w:p>
+    <w:p/>
+    <w:p>
+      <w:r>
+        <w:drawing>
+          <wp:inline distT="0" distB="0" distL="0" distR="0" wp14:anchorId="330FA359" wp14:editId="490A69E5">
+            <wp:extent cx="5400040" cy="2970530"/>
+            <wp:effectExtent l="0" t="0" r="0" b="1270"/>
+            <wp:docPr id="565764391" name="Picture 1"/>
+            <wp:cNvGraphicFramePr>
+              <a:graphicFrameLocks xmlns:a="http://schemas.openxmlformats.org/drawingml/2006/main" noChangeAspect="1"/>
+            </wp:cNvGraphicFramePr>
+            <a:graphic xmlns:a="http://schemas.openxmlformats.org/drawingml/2006/main">
+              <a:graphicData uri="http://schemas.openxmlformats.org/drawingml/2006/picture">
+                <pic:pic xmlns:pic="http://schemas.openxmlformats.org/drawingml/2006/picture">
+                  <pic:nvPicPr>
+                    <pic:cNvPr id="565764391" name=""/>
+                    <pic:cNvPicPr/>
+                  </pic:nvPicPr>
+                  <pic:blipFill>
+                    <a:blip r:embed="rId35"/>
+                    <a:stretch>
+                      <a:fillRect/>
+                    </a:stretch>
+                  </pic:blipFill>
+                  <pic:spPr>
+                    <a:xfrm>
+                      <a:off x="0" y="0"/>
+                      <a:ext cx="5400040" cy="2970530"/>
+                    </a:xfrm>
+                    <a:prstGeom prst="rect">
+                      <a:avLst/>
+                    </a:prstGeom>
+                  </pic:spPr>
+                </pic:pic>
+              </a:graphicData>
+            </a:graphic>
+          </wp:inline>
+        </w:drawing>
+      </w:r>
+    </w:p>
+    <w:p/>
+    <w:p>
+      <w:r>
+        <w:lastRenderedPageBreak/>
+        <w:drawing>
+          <wp:inline distT="0" distB="0" distL="0" distR="0" wp14:anchorId="40BC0DBD" wp14:editId="2DF3C340">
+            <wp:extent cx="5400040" cy="2126615"/>
+            <wp:effectExtent l="0" t="0" r="0" b="6985"/>
+            <wp:docPr id="1008718481" name="Picture 1"/>
+            <wp:cNvGraphicFramePr>
+              <a:graphicFrameLocks xmlns:a="http://schemas.openxmlformats.org/drawingml/2006/main" noChangeAspect="1"/>
+            </wp:cNvGraphicFramePr>
+            <a:graphic xmlns:a="http://schemas.openxmlformats.org/drawingml/2006/main">
+              <a:graphicData uri="http://schemas.openxmlformats.org/drawingml/2006/picture">
+                <pic:pic xmlns:pic="http://schemas.openxmlformats.org/drawingml/2006/picture">
+                  <pic:nvPicPr>
+                    <pic:cNvPr id="1008718481" name=""/>
+                    <pic:cNvPicPr/>
+                  </pic:nvPicPr>
+                  <pic:blipFill>
+                    <a:blip r:embed="rId36"/>
+                    <a:stretch>
+                      <a:fillRect/>
+                    </a:stretch>
+                  </pic:blipFill>
+                  <pic:spPr>
+                    <a:xfrm>
+                      <a:off x="0" y="0"/>
+                      <a:ext cx="5400040" cy="2126615"/>
                     </a:xfrm>
                     <a:prstGeom prst="rect">
                       <a:avLst/>

</xml_diff>